<commit_message>
Sync with latest local source and fix repository layout
Move help files into man/, remove committed tarballs and a duplicate
workflow, add .Rbuildignore and .gitignore.
</commit_message>
<xml_diff>
--- a/inst/templates/vcs_reference.docx
+++ b/inst/templates/vcs_reference.docx
@@ -485,7 +485,7 @@
   <w:docDefaults>
     <w:rPrDefault>
       <w:rPr>
-        <w:rFonts w:ascii="Century Gothic" w:hAnsi="Century Gothic" w:eastAsia="Century Gothic" w:cs="Century Gothic"/>
+        <w:rFonts w:ascii="Arial" w:hAnsi="Arial" w:eastAsia="Arial" w:cs="Arial"/>
         <w:sz w:val="21"/>
         <w:szCs w:val="21"/>
         <w:lang w:val="en-GB" w:eastAsia="en-US" w:bidi="ar-SA"/>
@@ -538,7 +538,7 @@
       <w:spacing w:before="0" w:after="200"/>
     </w:pPr>
     <w:rPr>
-      <w:rFonts w:ascii="Century Gothic" w:hAnsi="Century Gothic" w:cs="Century Gothic"/>
+      <w:rFonts w:ascii="Arial" w:hAnsi="Arial" w:cs="Arial"/>
       <w:color w:val="17365D"/>
       <w:sz w:val="52"/>
       <w:szCs w:val="52"/>
@@ -568,7 +568,7 @@
       <w:spacing w:before="0" w:after="160"/>
     </w:pPr>
     <w:rPr>
-      <w:rFonts w:ascii="Century Gothic" w:hAnsi="Century Gothic" w:cs="Century Gothic"/>
+      <w:rFonts w:ascii="Arial" w:hAnsi="Arial" w:cs="Arial"/>
       <w:color w:val="4F81BD"/>
       <w:sz w:val="24"/>
       <w:szCs w:val="24"/>
@@ -597,7 +597,7 @@
       <w:spacing w:before="0" w:after="60"/>
     </w:pPr>
     <w:rPr>
-      <w:rFonts w:ascii="Century Gothic" w:hAnsi="Century Gothic" w:cs="Century Gothic"/>
+      <w:rFonts w:ascii="Arial" w:hAnsi="Arial" w:cs="Arial"/>
       <w:color w:val="1A1A1A"/>
       <w:sz w:val="22"/>
       <w:szCs w:val="22"/>
@@ -612,7 +612,7 @@
       <w:spacing w:before="0" w:after="200"/>
     </w:pPr>
     <w:rPr>
-      <w:rFonts w:ascii="Century Gothic" w:hAnsi="Century Gothic" w:cs="Century Gothic"/>
+      <w:rFonts w:ascii="Arial" w:hAnsi="Arial" w:cs="Arial"/>
       <w:color w:val="1A1A1A"/>
       <w:sz w:val="22"/>
       <w:szCs w:val="22"/>
@@ -671,7 +671,7 @@
       <w:spacing w:before="360" w:after="160"/>
     </w:pPr>
     <w:rPr>
-      <w:rFonts w:ascii="Century Gothic" w:hAnsi="Century Gothic" w:cs="Century Gothic"/>
+      <w:rFonts w:ascii="Arial" w:hAnsi="Arial" w:cs="Arial"/>
       <w:b/>
       <w:bCs/>
       <w:color w:val="4E7D3A"/>
@@ -694,7 +694,7 @@
       <w:spacing w:before="280" w:after="120"/>
     </w:pPr>
     <w:rPr>
-      <w:rFonts w:ascii="Century Gothic" w:hAnsi="Century Gothic" w:cs="Century Gothic"/>
+      <w:rFonts w:ascii="Arial" w:hAnsi="Arial" w:cs="Arial"/>
       <w:b/>
       <w:bCs/>
       <w:color w:val="4E7D3A"/>
@@ -717,7 +717,7 @@
       <w:spacing w:before="240" w:after="100"/>
     </w:pPr>
     <w:rPr>
-      <w:rFonts w:ascii="Century Gothic" w:hAnsi="Century Gothic" w:cs="Century Gothic"/>
+      <w:rFonts w:ascii="Arial" w:hAnsi="Arial" w:cs="Arial"/>
       <w:b/>
       <w:bCs/>
       <w:color w:val="4E7D3A"/>
@@ -740,7 +740,7 @@
       <w:spacing w:before="200" w:after="80"/>
     </w:pPr>
     <w:rPr>
-      <w:rFonts w:ascii="Century Gothic" w:hAnsi="Century Gothic" w:cs="Century Gothic"/>
+      <w:rFonts w:ascii="Arial" w:hAnsi="Arial" w:cs="Arial"/>
       <w:b/>
       <w:bCs/>
       <w:color w:val="4F81BD"/>
@@ -1077,7 +1077,7 @@
       <w:spacing w:before="120" w:after="200"/>
     </w:pPr>
     <w:rPr>
-      <w:rFonts w:ascii="Century Gothic" w:hAnsi="Century Gothic" w:cs="Century Gothic"/>
+      <w:rFonts w:ascii="Arial" w:hAnsi="Arial" w:cs="Arial"/>
       <w:b/>
       <w:bCs/>
       <w:color w:val="1A1A1A"/>
@@ -1094,7 +1094,7 @@
       <w:spacing w:before="120" w:after="200"/>
     </w:pPr>
     <w:rPr>
-      <w:rFonts w:ascii="Century Gothic" w:hAnsi="Century Gothic" w:cs="Century Gothic"/>
+      <w:rFonts w:ascii="Arial" w:hAnsi="Arial" w:cs="Arial"/>
       <w:b/>
       <w:bCs/>
       <w:color w:val="1A1A1A"/>
@@ -1111,7 +1111,7 @@
       <w:spacing w:before="120" w:after="200"/>
     </w:pPr>
     <w:rPr>
-      <w:rFonts w:ascii="Century Gothic" w:hAnsi="Century Gothic" w:cs="Century Gothic"/>
+      <w:rFonts w:ascii="Arial" w:hAnsi="Arial" w:cs="Arial"/>
       <w:b/>
       <w:bCs/>
       <w:color w:val="1A1A1A"/>
@@ -1173,7 +1173,7 @@
       <w:spacing w:before="240" w:after="120"/>
     </w:pPr>
     <w:rPr>
-      <w:rFonts w:ascii="Century Gothic" w:hAnsi="Century Gothic" w:cs="Century Gothic"/>
+      <w:rFonts w:ascii="Arial" w:hAnsi="Arial" w:cs="Arial"/>
       <w:b/>
       <w:bCs/>
       <w:color w:val="4E7D3A"/>

</xml_diff>

<commit_message>
Apply Neudata Consulting Ltd theme
- pkgdown site in Neudata colours with grouped reference index
- vaxsurvR hex logo; Neudata banner, badges and footer in README
- vcs_palette() identity colours moved to Neudata teal/blue; meaning-
  carrying palettes (VCQI timeliness, MOSV, BeSD, antigens) unchanged
- Word reference template headings in Neudata colours
- URLs point to neu-data/vaxsurvR; issue labels and label-sync workflow
</commit_message>
<xml_diff>
--- a/inst/templates/vcs_reference.docx
+++ b/inst/templates/vcs_reference.docx
@@ -539,7 +539,7 @@
     </w:pPr>
     <w:rPr>
       <w:rFonts w:ascii="Arial" w:hAnsi="Arial" w:cs="Arial"/>
-      <w:color w:val="17365D"/>
+      <w:color w:val="04242F"/>
       <w:sz w:val="52"/>
       <w:szCs w:val="52"/>
     </w:rPr>
@@ -674,7 +674,7 @@
       <w:rFonts w:ascii="Arial" w:hAnsi="Arial" w:cs="Arial"/>
       <w:b/>
       <w:bCs/>
-      <w:color w:val="4E7D3A"/>
+      <w:color w:val="055F56"/>
       <w:sz w:val="28"/>
       <w:szCs w:val="28"/>
     </w:rPr>
@@ -697,7 +697,7 @@
       <w:rFonts w:ascii="Arial" w:hAnsi="Arial" w:cs="Arial"/>
       <w:b/>
       <w:bCs/>
-      <w:color w:val="4E7D3A"/>
+      <w:color w:val="055F56"/>
       <w:sz w:val="26"/>
       <w:szCs w:val="26"/>
     </w:rPr>
@@ -720,7 +720,7 @@
       <w:rFonts w:ascii="Arial" w:hAnsi="Arial" w:cs="Arial"/>
       <w:b/>
       <w:bCs/>
-      <w:color w:val="4E7D3A"/>
+      <w:color w:val="0B376C"/>
       <w:sz w:val="24"/>
       <w:szCs w:val="24"/>
     </w:rPr>

</xml_diff>